<commit_message>
Add optional OpenAI entity extraction
</commit_message>
<xml_diff>
--- a/outputs/generated_affidavit.docx
+++ b/outputs/generated_affidavit.docx
@@ -158,7 +158,7 @@
         <w:t xml:space="preserve">3. </w:t>
       </w:r>
       <w:r>
-        <w:t>I say that the Writ Petition is misconceived and devoid of merits. The actions challenged by the Petitioner were taken in accordance with the applicable redevelopment procedure and within the authority available to Respondent No. 2. The action complained of has been taken strictly in accordance with law and after following due procedure. No legal, constitutional or fundamental right of the Petitioner has been infringed.</w:t>
+        <w:t>I say that the Petitioner has suppressed material facts. The Writ Petition is misconceived and devoid of merits. The actions challenged by the Petitioner were taken in accordance with the applicable redevelopment procedure and within the authority available to Respondent No. 2. The action complained of has been taken strictly in accordance with law and after following due procedure. No legal, constitutional or fundamental right of the Petitioner has been infringed.</w:t>
       </w:r>
     </w:p>
     <w:p>
@@ -172,7 +172,7 @@
         <w:t xml:space="preserve">4. </w:t>
       </w:r>
       <w:r>
-        <w:t>With reference to the averments made in the WRIT PETITION regarding denial regarding the communication, I say that respondent No. 2 denies that the impugned communication dated 15 July 2026 was issued without authority.</w:t>
+        <w:t>With reference to the averments made in the Petition, I say that respondent No. 2 denies that the impugned communication dated 15 July 2026 was issued without authority.</w:t>
       </w:r>
     </w:p>
     <w:p>
@@ -186,7 +186,7 @@
         <w:t xml:space="preserve">5. </w:t>
       </w:r>
       <w:r>
-        <w:t>With reference to the averments made in the WRIT PETITION regarding authority for the communication, I say that the communication dated 15 July 2026 was issued pursuant to the applicable redevelopment procedure and after consideration of the relevant records.</w:t>
+        <w:t>With reference to the averments made in the Petition, I say that the communication dated 15 July 2026 was issued pursuant to the applicable redevelopment procedure and after consideration of the relevant records.</w:t>
       </w:r>
     </w:p>
     <w:p>
@@ -200,7 +200,7 @@
         <w:t xml:space="preserve">6. </w:t>
       </w:r>
       <w:r>
-        <w:t>With reference to the averments made in the WRIT PETITION regarding document relied upon, I say that respondent No. 2 relies upon the communication dated 15 July 2026. A copy of that communication is to be annexed and marked as EXHIBIT-'A'. Hereto annexed and marked as EXHIBIT-'A' is a true copy of the said communication.</w:t>
+        <w:t>With reference to the averments made in the Petition, I say that respondent No. 2 relies upon the communication dated 15 July 2026. A copy of that communication is to be annexed and marked as EXHIBIT-'A'. Hereto annexed and marked as EXHIBIT-'A' is a true copy of the said communication.</w:t>
       </w:r>
     </w:p>
     <w:p>

</xml_diff>